<commit_message>
docs: update report with correct lecturer and course details
</commit_message>
<xml_diff>
--- a/FIDO_REPORT_DOCUMENT.docx
+++ b/FIDO_REPORT_DOCUMENT.docx
@@ -180,7 +180,7 @@
           <w:szCs w:val="40"/>
           <w:bdr w:val="none" w:color="auto" w:sz="0" w:space="0"/>
         </w:rPr>
-        <w:t>HỌC PHẦN: LẬP TRÌNH WEB</w:t>
+        <w:t>HỌC PHẦN: BẢO MẬT THÔNG TIN</w:t>
       </w:r>
     </w:p>
     <w:p>
@@ -314,7 +314,7 @@
           <w:sz w:val="28"/>
           <w:szCs w:val="28"/>
         </w:rPr>
-        <w:t>Mã học phần: IT403 (Lập trình Web)</w:t>
+        <w:t>Mã học phần: IT403 (Bảo mật thông tin)</w:t>
       </w:r>
       <w:r>
         <w:rPr>
@@ -332,7 +332,7 @@
           <w:sz w:val="28"/>
           <w:szCs w:val="28"/>
         </w:rPr>
-        <w:t>Giảng viên hướng dẫn: ThS. Nguyễn Văn A</w:t>
+        <w:t>Giảng viên hướng dẫn: ThS. Nguyễn Trọng Minh Hồng Phước</w:t>
       </w:r>
       <w:r>
         <w:rPr>
@@ -504,7 +504,7 @@
     </w:p>
     <w:p>
       <w:pPr>
-        <w:pStyle w:val="20"/>
+        <w:pStyle w:val="24"/>
         <w:keepNext w:val="0"/>
         <w:keepLines w:val="0"/>
         <w:widowControl/>
@@ -530,12 +530,12 @@
           <w:sz w:val="26"/>
           <w:szCs w:val="26"/>
         </w:rPr>
-        <w:t xml:space="preserve"> LẬP TRÌNH WEB</w:t>
-      </w:r>
-    </w:p>
-    <w:p>
-      <w:pPr>
-        <w:pStyle w:val="20"/>
+        <w:t xml:space="preserve"> BẢO MẬT THÔNG TIN</w:t>
+      </w:r>
+    </w:p>
+    <w:p>
+      <w:pPr>
+        <w:pStyle w:val="24"/>
         <w:keepNext w:val="0"/>
         <w:keepLines w:val="0"/>
         <w:widowControl/>
@@ -566,7 +566,7 @@
     </w:p>
     <w:p>
       <w:pPr>
-        <w:pStyle w:val="20"/>
+        <w:pStyle w:val="24"/>
         <w:keepNext w:val="0"/>
         <w:keepLines w:val="0"/>
         <w:widowControl/>
@@ -653,6 +653,12 @@
             <w:insideV w:val="none" w:color="auto" w:sz="0" w:space="0"/>
           </w:tblBorders>
           <w:shd w:val="clear"/>
+          <w:tblCellMar>
+            <w:top w:w="15" w:type="dxa"/>
+            <w:left w:w="15" w:type="dxa"/>
+            <w:bottom w:w="15" w:type="dxa"/>
+            <w:right w:w="15" w:type="dxa"/>
+          </w:tblCellMar>
         </w:tblPrEx>
         <w:trPr>
           <w:tblHeader/>
@@ -1638,7 +1644,7 @@
     </w:tbl>
     <w:p>
       <w:pPr>
-        <w:pStyle w:val="20"/>
+        <w:pStyle w:val="24"/>
         <w:keepNext w:val="0"/>
         <w:keepLines w:val="0"/>
         <w:widowControl/>
@@ -1659,7 +1665,7 @@
     </w:p>
     <w:p>
       <w:pPr>
-        <w:pStyle w:val="20"/>
+        <w:pStyle w:val="24"/>
         <w:keepNext w:val="0"/>
         <w:keepLines w:val="0"/>
         <w:widowControl/>
@@ -1681,7 +1687,7 @@
     </w:p>
     <w:p>
       <w:pPr>
-        <w:pStyle w:val="20"/>
+        <w:pStyle w:val="24"/>
         <w:keepNext w:val="0"/>
         <w:keepLines w:val="0"/>
         <w:widowControl/>
@@ -1733,7 +1739,7 @@
           <w:szCs w:val="26"/>
           <w:bdr w:val="none" w:color="auto" w:sz="0" w:space="0"/>
         </w:rPr>
-        <w:t>Lời đầu tiên, nhóm thực hiện đồ án chúng em xin được bày tỏ lòng cảm ơn sâu sắc nhất tới ThS. Nguyễn Văn A - Giảng viên hướng dẫn học phần Lập trình Web. Thầy đã tận tình định hướng đề tài, chia sẻ những kiến thức chuyên môn quý báu và đưa ra những góp ý quan trọng để giúp nhóm hoàn thiện hệ thống một cách tối ưu.</w:t>
+        <w:t>Lời đầu tiên, nhóm thực hiện đồ án chúng em xin được bày tỏ lòng cảm ơn sâu sắc nhất tới ThS. Nguyễn Trọng Minh Hồng Phước - Giảng viên hướng dẫn học Bảo Mật Thông Tin. Thầy đã tận tình định hướng đề tài, chia sẻ những kiến thức chuyên môn quý báu và đưa ra những góp ý quan trọng để giúp nhóm hoàn thiện hệ thống một cách tối ưu.</w:t>
       </w:r>
     </w:p>
     <w:p>
@@ -1814,7 +1820,7 @@
     </w:p>
     <w:p>
       <w:pPr>
-        <w:pStyle w:val="20"/>
+        <w:pStyle w:val="24"/>
         <w:keepNext w:val="0"/>
         <w:keepLines w:val="0"/>
         <w:widowControl/>
@@ -1840,12 +1846,12 @@
           <w:sz w:val="26"/>
           <w:szCs w:val="26"/>
         </w:rPr>
-        <w:t xml:space="preserve"> LẬP TRÌNH WEB</w:t>
-      </w:r>
-    </w:p>
-    <w:p>
-      <w:pPr>
-        <w:pStyle w:val="20"/>
+        <w:t xml:space="preserve"> BẢO MẬT THÔNG TIN</w:t>
+      </w:r>
+    </w:p>
+    <w:p>
+      <w:pPr>
+        <w:pStyle w:val="24"/>
         <w:keepNext w:val="0"/>
         <w:keepLines w:val="0"/>
         <w:widowControl/>
@@ -1876,7 +1882,7 @@
     </w:p>
     <w:p>
       <w:pPr>
-        <w:pStyle w:val="20"/>
+        <w:pStyle w:val="24"/>
         <w:keepNext w:val="0"/>
         <w:keepLines w:val="0"/>
         <w:widowControl/>
@@ -5957,7 +5963,7 @@
     </w:p>
     <w:p>
       <w:pPr>
-        <w:pStyle w:val="20"/>
+        <w:pStyle w:val="24"/>
         <w:keepNext w:val="0"/>
         <w:keepLines w:val="0"/>
         <w:widowControl/>
@@ -5997,7 +6003,7 @@
     </w:p>
     <w:p>
       <w:pPr>
-        <w:pStyle w:val="20"/>
+        <w:pStyle w:val="24"/>
         <w:keepNext w:val="0"/>
         <w:keepLines w:val="0"/>
         <w:widowControl/>
@@ -6037,7 +6043,7 @@
     </w:p>
     <w:p>
       <w:pPr>
-        <w:pStyle w:val="20"/>
+        <w:pStyle w:val="24"/>
         <w:keepNext w:val="0"/>
         <w:keepLines w:val="0"/>
         <w:widowControl/>
@@ -6077,7 +6083,7 @@
     </w:p>
     <w:p>
       <w:pPr>
-        <w:pStyle w:val="20"/>
+        <w:pStyle w:val="24"/>
         <w:keepNext w:val="0"/>
         <w:keepLines w:val="0"/>
         <w:widowControl/>
@@ -6127,9 +6133,9 @@
 <file path=word/numbering.xml><?xml version="1.0" encoding="utf-8"?>
 <w:numbering xmlns:wpc="http://schemas.microsoft.com/office/word/2010/wordprocessingCanvas" xmlns:mc="http://schemas.openxmlformats.org/markup-compatibility/2006" xmlns:o="urn:schemas-microsoft-com:office:office" xmlns:r="http://schemas.openxmlformats.org/officeDocument/2006/relationships" xmlns:m="http://schemas.openxmlformats.org/officeDocument/2006/math" xmlns:v="urn:schemas-microsoft-com:vml" xmlns:wp14="http://schemas.microsoft.com/office/word/2010/wordprocessingDrawing" xmlns:wp="http://schemas.openxmlformats.org/drawingml/2006/wordprocessingDrawing" xmlns:w10="urn:schemas-microsoft-com:office:word" xmlns:w="http://schemas.openxmlformats.org/wordprocessingml/2006/main" xmlns:w14="http://schemas.microsoft.com/office/word/2010/wordml" xmlns:wpg="http://schemas.microsoft.com/office/word/2010/wordprocessingGroup" xmlns:wpi="http://schemas.microsoft.com/office/word/2010/wordprocessingInk" xmlns:wne="http://schemas.microsoft.com/office/word/2006/wordml" xmlns:wps="http://schemas.microsoft.com/office/word/2010/wordprocessingShape" xmlns:wpsCustomData="http://www.wps.cn/officeDocument/2013/wpsCustomData" mc:Ignorable="w14 wp14">
   <w:abstractNum w:abstractNumId="0">
-    <w:nsid w:val="233F2D62"/>
+    <w:nsid w:val="AC16C424"/>
     <w:multiLevelType w:val="multilevel"/>
-    <w:tmpl w:val="233F2D62"/>
+    <w:tmpl w:val="AC16C424"/>
     <w:lvl w:ilvl="0" w:tentative="0">
       <w:start w:val="1"/>
       <w:numFmt w:val="bullet"/>
@@ -6804,6 +6810,23 @@
     </w:rPr>
   </w:style>
   <w:style w:type="paragraph" w:customStyle="1" w:styleId="15">
+    <w:name w:val="cover-subtitle"/>
+    <w:basedOn w:val="1"/>
+    <w:uiPriority w:val="0"/>
+    <w:pPr>
+      <w:spacing w:after="800" w:afterAutospacing="0"/>
+      <w:jc w:val="left"/>
+    </w:pPr>
+    <w:rPr>
+      <w:b/>
+      <w:bCs/>
+      <w:kern w:val="0"/>
+      <w:sz w:val="40"/>
+      <w:szCs w:val="40"/>
+      <w:lang w:val="en-US" w:eastAsia="zh-CN" w:bidi="ar"/>
+    </w:rPr>
+  </w:style>
+  <w:style w:type="paragraph" w:customStyle="1" w:styleId="16">
     <w:name w:val="alert-box"/>
     <w:basedOn w:val="1"/>
     <w:uiPriority w:val="0"/>
@@ -6824,7 +6847,67 @@
       <w:lang w:val="en-US" w:eastAsia="zh-CN" w:bidi="ar"/>
     </w:rPr>
   </w:style>
-  <w:style w:type="paragraph" w:customStyle="1" w:styleId="16">
+  <w:style w:type="paragraph" w:customStyle="1" w:styleId="17">
+    <w:name w:val="cover-title"/>
+    <w:basedOn w:val="1"/>
+    <w:uiPriority w:val="0"/>
+    <w:pPr>
+      <w:spacing w:before="1000" w:beforeAutospacing="0" w:after="400" w:afterAutospacing="0"/>
+      <w:jc w:val="left"/>
+    </w:pPr>
+    <w:rPr>
+      <w:b/>
+      <w:bCs/>
+      <w:kern w:val="0"/>
+      <w:sz w:val="40"/>
+      <w:szCs w:val="40"/>
+      <w:lang w:val="en-US" w:eastAsia="zh-CN" w:bidi="ar"/>
+    </w:rPr>
+  </w:style>
+  <w:style w:type="paragraph" w:customStyle="1" w:styleId="18">
+    <w:name w:val="cover-footer"/>
+    <w:basedOn w:val="1"/>
+    <w:uiPriority w:val="0"/>
+    <w:pPr>
+      <w:spacing w:before="0" w:beforeAutospacing="1"/>
+      <w:jc w:val="left"/>
+    </w:pPr>
+    <w:rPr>
+      <w:kern w:val="0"/>
+      <w:sz w:val="28"/>
+      <w:szCs w:val="28"/>
+      <w:lang w:val="en-US" w:eastAsia="zh-CN" w:bidi="ar"/>
+    </w:rPr>
+  </w:style>
+  <w:style w:type="paragraph" w:customStyle="1" w:styleId="19">
+    <w:name w:val="cover-details"/>
+    <w:basedOn w:val="1"/>
+    <w:uiPriority w:val="0"/>
+    <w:pPr>
+      <w:spacing w:after="1600" w:afterAutospacing="0" w:line="27" w:lineRule="atLeast"/>
+      <w:ind w:left="0"/>
+      <w:jc w:val="left"/>
+    </w:pPr>
+    <w:rPr>
+      <w:kern w:val="0"/>
+      <w:sz w:val="28"/>
+      <w:szCs w:val="28"/>
+      <w:lang w:val="en-US" w:eastAsia="zh-CN" w:bidi="ar"/>
+    </w:rPr>
+  </w:style>
+  <w:style w:type="paragraph" w:customStyle="1" w:styleId="20">
+    <w:name w:val="right-text"/>
+    <w:basedOn w:val="1"/>
+    <w:uiPriority w:val="0"/>
+    <w:pPr>
+      <w:jc w:val="right"/>
+    </w:pPr>
+    <w:rPr>
+      <w:kern w:val="0"/>
+      <w:lang w:val="en-US" w:eastAsia="zh-CN" w:bidi="ar"/>
+    </w:rPr>
+  </w:style>
+  <w:style w:type="paragraph" w:customStyle="1" w:styleId="21">
     <w:name w:val="page-break"/>
     <w:basedOn w:val="1"/>
     <w:uiPriority w:val="0"/>
@@ -6837,24 +6920,19 @@
       <w:lang w:val="en-US" w:eastAsia="zh-CN" w:bidi="ar"/>
     </w:rPr>
   </w:style>
-  <w:style w:type="paragraph" w:customStyle="1" w:styleId="17">
-    <w:name w:val="cover-subtitle"/>
+  <w:style w:type="paragraph" w:customStyle="1" w:styleId="22">
+    <w:name w:val="center-text"/>
     <w:basedOn w:val="1"/>
     <w:uiPriority w:val="0"/>
     <w:pPr>
-      <w:spacing w:after="800" w:afterAutospacing="0"/>
-      <w:jc w:val="left"/>
+      <w:jc w:val="center"/>
     </w:pPr>
     <w:rPr>
-      <w:b/>
-      <w:bCs/>
       <w:kern w:val="0"/>
-      <w:sz w:val="40"/>
-      <w:szCs w:val="40"/>
       <w:lang w:val="en-US" w:eastAsia="zh-CN" w:bidi="ar"/>
     </w:rPr>
   </w:style>
-  <w:style w:type="paragraph" w:customStyle="1" w:styleId="18">
+  <w:style w:type="paragraph" w:customStyle="1" w:styleId="23">
     <w:name w:val="cover-page"/>
     <w:basedOn w:val="1"/>
     <w:uiPriority w:val="0"/>
@@ -6872,22 +6950,7 @@
       <w:lang w:val="en-US" w:eastAsia="zh-CN" w:bidi="ar"/>
     </w:rPr>
   </w:style>
-  <w:style w:type="paragraph" w:customStyle="1" w:styleId="19">
-    <w:name w:val="alert-title"/>
-    <w:basedOn w:val="1"/>
-    <w:uiPriority w:val="0"/>
-    <w:pPr>
-      <w:spacing w:after="60" w:afterAutospacing="0"/>
-      <w:jc w:val="left"/>
-    </w:pPr>
-    <w:rPr>
-      <w:b/>
-      <w:bCs/>
-      <w:kern w:val="0"/>
-      <w:lang w:val="en-US" w:eastAsia="zh-CN" w:bidi="ar"/>
-    </w:rPr>
-  </w:style>
-  <w:style w:type="paragraph" w:customStyle="1" w:styleId="20">
+  <w:style w:type="paragraph" w:customStyle="1" w:styleId="24">
     <w:name w:val="no-indent"/>
     <w:basedOn w:val="1"/>
     <w:uiPriority w:val="0"/>
@@ -6900,19 +6963,7 @@
       <w:lang w:val="en-US" w:eastAsia="zh-CN" w:bidi="ar"/>
     </w:rPr>
   </w:style>
-  <w:style w:type="paragraph" w:customStyle="1" w:styleId="21">
-    <w:name w:val="center-text"/>
-    <w:basedOn w:val="1"/>
-    <w:uiPriority w:val="0"/>
-    <w:pPr>
-      <w:jc w:val="center"/>
-    </w:pPr>
-    <w:rPr>
-      <w:kern w:val="0"/>
-      <w:lang w:val="en-US" w:eastAsia="zh-CN" w:bidi="ar"/>
-    </w:rPr>
-  </w:style>
-  <w:style w:type="paragraph" w:customStyle="1" w:styleId="22">
+  <w:style w:type="paragraph" w:customStyle="1" w:styleId="25">
     <w:name w:val="cover-topic"/>
     <w:basedOn w:val="1"/>
     <w:uiPriority w:val="0"/>
@@ -6929,63 +6980,18 @@
       <w:lang w:val="en-US" w:eastAsia="zh-CN" w:bidi="ar"/>
     </w:rPr>
   </w:style>
-  <w:style w:type="paragraph" w:customStyle="1" w:styleId="23">
-    <w:name w:val="right-text"/>
+  <w:style w:type="paragraph" w:customStyle="1" w:styleId="26">
+    <w:name w:val="alert-title"/>
     <w:basedOn w:val="1"/>
     <w:uiPriority w:val="0"/>
     <w:pPr>
-      <w:jc w:val="right"/>
-    </w:pPr>
-    <w:rPr>
-      <w:kern w:val="0"/>
-      <w:lang w:val="en-US" w:eastAsia="zh-CN" w:bidi="ar"/>
-    </w:rPr>
-  </w:style>
-  <w:style w:type="paragraph" w:customStyle="1" w:styleId="24">
-    <w:name w:val="cover-title"/>
-    <w:basedOn w:val="1"/>
-    <w:uiPriority w:val="0"/>
-    <w:pPr>
-      <w:spacing w:before="1000" w:beforeAutospacing="0" w:after="400" w:afterAutospacing="0"/>
+      <w:spacing w:after="60" w:afterAutospacing="0"/>
       <w:jc w:val="left"/>
     </w:pPr>
     <w:rPr>
       <w:b/>
       <w:bCs/>
       <w:kern w:val="0"/>
-      <w:sz w:val="40"/>
-      <w:szCs w:val="40"/>
-      <w:lang w:val="en-US" w:eastAsia="zh-CN" w:bidi="ar"/>
-    </w:rPr>
-  </w:style>
-  <w:style w:type="paragraph" w:customStyle="1" w:styleId="25">
-    <w:name w:val="cover-details"/>
-    <w:basedOn w:val="1"/>
-    <w:uiPriority w:val="0"/>
-    <w:pPr>
-      <w:spacing w:after="1600" w:afterAutospacing="0" w:line="27" w:lineRule="atLeast"/>
-      <w:ind w:left="0"/>
-      <w:jc w:val="left"/>
-    </w:pPr>
-    <w:rPr>
-      <w:kern w:val="0"/>
-      <w:sz w:val="28"/>
-      <w:szCs w:val="28"/>
-      <w:lang w:val="en-US" w:eastAsia="zh-CN" w:bidi="ar"/>
-    </w:rPr>
-  </w:style>
-  <w:style w:type="paragraph" w:customStyle="1" w:styleId="26">
-    <w:name w:val="cover-footer"/>
-    <w:basedOn w:val="1"/>
-    <w:uiPriority w:val="0"/>
-    <w:pPr>
-      <w:spacing w:before="0" w:beforeAutospacing="1"/>
-      <w:jc w:val="left"/>
-    </w:pPr>
-    <w:rPr>
-      <w:kern w:val="0"/>
-      <w:sz w:val="28"/>
-      <w:szCs w:val="28"/>
       <w:lang w:val="en-US" w:eastAsia="zh-CN" w:bidi="ar"/>
     </w:rPr>
   </w:style>

</xml_diff>